<commit_message>
Trim commercial proposal to core scope
</commit_message>
<xml_diff>
--- a/docs/Коммерческое предложение База объектов недвижимости.docx
+++ b/docs/Коммерческое предложение База объектов недвижимости.docx
@@ -1417,311 +1417,6 @@
         <w:t>3. 50% после завершения разработки и проверки готовой системы.</w:t>
       </w:r>
     </w:p>
-    <w:p>
-      <w:r>
-        <w:br w:type="page"/>
-      </w:r>
-    </w:p>
-    <w:p>
-      <w:pPr>
-        <w:pStyle w:val="Heading1"/>
-      </w:pPr>
-      <w:r>
-        <w:t>Что входит в стоимость</w:t>
-      </w:r>
-    </w:p>
-    <w:p>
-      <w:pPr>
-        <w:pStyle w:val="ListBullet"/>
-        <w:keepLines/>
-      </w:pPr>
-      <w:r>
-        <w:rPr>
-          <w:color w:val="1E222A"/>
-        </w:rPr>
-        <w:t>подготовка технического задания;</w:t>
-      </w:r>
-    </w:p>
-    <w:p>
-      <w:pPr>
-        <w:pStyle w:val="ListBullet"/>
-        <w:keepLines/>
-      </w:pPr>
-      <w:r>
-        <w:rPr>
-          <w:color w:val="1E222A"/>
-        </w:rPr>
-        <w:t>дизайн и разработка интерфейса;</w:t>
-      </w:r>
-    </w:p>
-    <w:p>
-      <w:pPr>
-        <w:pStyle w:val="ListBullet"/>
-        <w:keepLines/>
-      </w:pPr>
-      <w:r>
-        <w:rPr>
-          <w:color w:val="1E222A"/>
-        </w:rPr>
-        <w:t>серверная часть и база данных;</w:t>
-      </w:r>
-    </w:p>
-    <w:p>
-      <w:pPr>
-        <w:pStyle w:val="ListBullet"/>
-        <w:keepLines/>
-      </w:pPr>
-      <w:r>
-        <w:rPr>
-          <w:color w:val="1E222A"/>
-        </w:rPr>
-        <w:t>функции, зафиксированные в техническом задании;</w:t>
-      </w:r>
-    </w:p>
-    <w:p>
-      <w:pPr>
-        <w:pStyle w:val="ListBullet"/>
-        <w:keepLines/>
-      </w:pPr>
-      <w:r>
-        <w:rPr>
-          <w:color w:val="1E222A"/>
-        </w:rPr>
-        <w:t>подключение OLX и DIM.RIA при наличии доступного API;</w:t>
-      </w:r>
-    </w:p>
-    <w:p>
-      <w:pPr>
-        <w:pStyle w:val="ListBullet"/>
-        <w:keepLines/>
-      </w:pPr>
-      <w:r>
-        <w:rPr>
-          <w:color w:val="1E222A"/>
-        </w:rPr>
-        <w:t>подключение согласованного способа отправки подборок через Telegram;</w:t>
-      </w:r>
-    </w:p>
-    <w:p>
-      <w:pPr>
-        <w:pStyle w:val="ListBullet"/>
-        <w:keepLines/>
-      </w:pPr>
-      <w:r>
-        <w:rPr>
-          <w:color w:val="1E222A"/>
-        </w:rPr>
-        <w:t>базовый перенос объектов из согласованного файла;</w:t>
-      </w:r>
-    </w:p>
-    <w:p>
-      <w:pPr>
-        <w:pStyle w:val="ListBullet"/>
-        <w:keepLines/>
-      </w:pPr>
-      <w:r>
-        <w:rPr>
-          <w:color w:val="1E222A"/>
-        </w:rPr>
-        <w:t>запуск рабочей версии;</w:t>
-      </w:r>
-    </w:p>
-    <w:p>
-      <w:pPr>
-        <w:pStyle w:val="ListBullet"/>
-        <w:keepLines/>
-      </w:pPr>
-      <w:r>
-        <w:rPr>
-          <w:color w:val="1E222A"/>
-        </w:rPr>
-        <w:t>краткое обучение администратора;</w:t>
-      </w:r>
-    </w:p>
-    <w:p>
-      <w:pPr>
-        <w:pStyle w:val="ListBullet"/>
-        <w:keepLines/>
-      </w:pPr>
-      <w:r>
-        <w:rPr>
-          <w:color w:val="1E222A"/>
-        </w:rPr>
-        <w:t>исправление обнаруженных ошибок в течение 30 календарных дней после запуска.</w:t>
-      </w:r>
-    </w:p>
-    <w:p>
-      <w:pPr>
-        <w:pStyle w:val="Heading1"/>
-      </w:pPr>
-      <w:r>
-        <w:t>Что оплачивается отдельно</w:t>
-      </w:r>
-    </w:p>
-    <w:p>
-      <w:pPr>
-        <w:pStyle w:val="ListBullet"/>
-        <w:keepLines/>
-      </w:pPr>
-      <w:r>
-        <w:rPr>
-          <w:color w:val="1E222A"/>
-        </w:rPr>
-        <w:t>тарифы OLX, DIM.RIA и других внешних сервисов;</w:t>
-      </w:r>
-    </w:p>
-    <w:p>
-      <w:pPr>
-        <w:pStyle w:val="ListBullet"/>
-        <w:keepLines/>
-      </w:pPr>
-      <w:r>
-        <w:rPr>
-          <w:color w:val="1E222A"/>
-        </w:rPr>
-        <w:t>домен, сервер, файловое хранилище и почтовые сервисы;</w:t>
-      </w:r>
-    </w:p>
-    <w:p>
-      <w:pPr>
-        <w:pStyle w:val="ListBullet"/>
-        <w:keepLines/>
-      </w:pPr>
-      <w:r>
-        <w:rPr>
-          <w:color w:val="1E222A"/>
-        </w:rPr>
-        <w:t>Telegram-бот или мини-приложение с отдельной логикой, если оно не входит в согласованное техническое задание;</w:t>
-      </w:r>
-    </w:p>
-    <w:p>
-      <w:pPr>
-        <w:pStyle w:val="ListBullet"/>
-        <w:keepLines/>
-      </w:pPr>
-      <w:r>
-        <w:rPr>
-          <w:color w:val="1E222A"/>
-        </w:rPr>
-        <w:t>нестандартный парсинг сторонних сайтов;</w:t>
-      </w:r>
-    </w:p>
-    <w:p>
-      <w:pPr>
-        <w:pStyle w:val="ListBullet"/>
-        <w:keepLines/>
-      </w:pPr>
-      <w:r>
-        <w:rPr>
-          <w:color w:val="1E222A"/>
-        </w:rPr>
-        <w:t>новые функции, которых нет в согласованном техническом задании;</w:t>
-      </w:r>
-    </w:p>
-    <w:p>
-      <w:pPr>
-        <w:pStyle w:val="ListBullet"/>
-        <w:keepLines/>
-      </w:pPr>
-      <w:r>
-        <w:rPr>
-          <w:color w:val="1E222A"/>
-        </w:rPr>
-        <w:t>постоянное сопровождение и дальнейшее развитие базы.</w:t>
-      </w:r>
-    </w:p>
-    <w:p>
-      <w:pPr>
-        <w:pStyle w:val="Heading1"/>
-      </w:pPr>
-      <w:r>
-        <w:t>Ориентировочные расходы на инфраструктуру</w:t>
-      </w:r>
-    </w:p>
-    <w:p>
-      <w:pPr>
-        <w:keepLines/>
-      </w:pPr>
-      <w:r>
-        <w:rPr>
-          <w:color w:val="1E222A"/>
-        </w:rPr>
-        <w:t>При небольшом объёме использования сервер и хранение данных будут стоить ориентировочно $10-$30 в месяц. Фактическая сумма зависит от количества фотографий, документов, пользователей и операций.</w:t>
-      </w:r>
-    </w:p>
-    <w:p>
-      <w:r>
-        <w:br w:type="page"/>
-      </w:r>
-    </w:p>
-    <w:p>
-      <w:pPr>
-        <w:pStyle w:val="Heading1"/>
-      </w:pPr>
-      <w:r>
-        <w:t>Условия интеграций</w:t>
-      </w:r>
-    </w:p>
-    <w:p>
-      <w:pPr>
-        <w:keepLines/>
-      </w:pPr>
-      <w:r>
-        <w:rPr>
-          <w:color w:val="1E222A"/>
-        </w:rPr>
-        <w:t>Для подключения OLX и DIM.RIA нужны рабочие корпоративные аккаунты и доступы к API. Стоимость размещений, лимиты объявлений и модерация определяются самими площадками и не входят в стоимость разработки.</w:t>
-      </w:r>
-    </w:p>
-    <w:p>
-      <w:pPr>
-        <w:keepLines/>
-      </w:pPr>
-      <w:r>
-        <w:rPr>
-          <w:color w:val="1E222A"/>
-        </w:rPr>
-        <w:t>Если нужная функция недоступна через официальный API, возможный вариант реализации согласовывается отдельно до начала интеграции.</w:t>
-      </w:r>
-    </w:p>
-    <w:p>
-      <w:pPr>
-        <w:pStyle w:val="Heading1"/>
-      </w:pPr>
-      <w:r>
-        <w:t>Передача системы</w:t>
-      </w:r>
-    </w:p>
-    <w:p>
-      <w:pPr>
-        <w:keepLines/>
-      </w:pPr>
-      <w:r>
-        <w:rPr>
-          <w:color w:val="1E222A"/>
-        </w:rPr>
-        <w:t>Агентство получает рабочую систему и полный доступ к своим данным. Универсальное ядро и отдельные технические компоненты могут использоваться разработчиком в других проектах. Данные агентства, документы и контакты не передаются и не используются вне системы.</w:t>
-      </w:r>
-    </w:p>
-    <w:p>
-      <w:pPr>
-        <w:pStyle w:val="Heading1"/>
-      </w:pPr>
-      <w:r>
-        <w:t>Начало работы</w:t>
-      </w:r>
-    </w:p>
-    <w:p>
-      <w:pPr>
-        <w:keepLines/>
-      </w:pPr>
-      <w:r>
-        <w:rPr>
-          <w:color w:val="1E222A"/>
-        </w:rPr>
-        <w:t>Для старта необходимо согласовать состав базы, предоставить пример текущей таблицы объектов и проверить доступы к OLX и DIM.RIA. После подготовки технического задания фиксируются итоговая стоимость и календарный план.</w:t>
-      </w:r>
-    </w:p>
     <w:sectPr>
       <w:footerReference w:type="default" r:id="rId9"/>
       <w:pgSz w:w="12240" w:h="15840"/>

</xml_diff>